<commit_message>
Issue #5: publish Final3 Copilot and PAD acceptance evidence
</commit_message>
<xml_diff>
--- a/catalog/evidence/normal-chat-t06-final.docx
+++ b/catalog/evidence/normal-chat-t06-final.docx
@@ -974,7 +974,7 @@
     <w:link w:val="ab"/>
     <w:uiPriority w:val="99"/>
     <w:unhideWhenUsed/>
-    <w:rsid w:val="00C357AD"/>
+    <w:rsid w:val="00EC60B1"/>
     <w:pPr>
       <w:tabs>
         <w:tab w:val="center" w:pos="4252"/>
@@ -988,7 +988,7 @@
     <w:basedOn w:val="a0"/>
     <w:link w:val="aa"/>
     <w:uiPriority w:val="99"/>
-    <w:rsid w:val="00C357AD"/>
+    <w:rsid w:val="00EC60B1"/>
   </w:style>
   <w:style w:type="paragraph" w:styleId="ac">
     <w:name w:val="footer"/>
@@ -996,7 +996,7 @@
     <w:link w:val="ad"/>
     <w:uiPriority w:val="99"/>
     <w:unhideWhenUsed/>
-    <w:rsid w:val="00C357AD"/>
+    <w:rsid w:val="00EC60B1"/>
     <w:pPr>
       <w:tabs>
         <w:tab w:val="center" w:pos="4252"/>
@@ -1010,7 +1010,7 @@
     <w:basedOn w:val="a0"/>
     <w:link w:val="ac"/>
     <w:uiPriority w:val="99"/>
-    <w:rsid w:val="00C357AD"/>
+    <w:rsid w:val="00EC60B1"/>
   </w:style>
 </w:styles>
 </file>

</xml_diff>